<commit_message>
dokumentacio feladatok felosztasa tablazat beszurva
</commit_message>
<xml_diff>
--- a/QuizCards Dokumentáció.docx
+++ b/QuizCards Dokumentáció.docx
@@ -4,6 +4,15 @@
   <w:body>
     <w:sdt>
       <w:sdtPr>
+        <w:rPr>
+          <w:rFonts w:ascii="Arial" w:eastAsiaTheme="minorHAnsi" w:hAnsi="Arial" w:cstheme="minorBidi"/>
+          <w:color w:val="auto"/>
+          <w:kern w:val="2"/>
+          <w:sz w:val="28"/>
+          <w:szCs w:val="24"/>
+          <w:lang w:eastAsia="en-US"/>
+          <w14:ligatures w14:val="standardContextual"/>
+        </w:rPr>
         <w:id w:val="1179936330"/>
         <w:docPartObj>
           <w:docPartGallery w:val="Table of Contents"/>
@@ -12,15 +21,8 @@
       </w:sdtPr>
       <w:sdtEndPr>
         <w:rPr>
-          <w:rFonts w:ascii="Arial" w:eastAsiaTheme="minorHAnsi" w:hAnsi="Arial" w:cstheme="minorBidi"/>
           <w:b/>
           <w:bCs/>
-          <w:color w:val="auto"/>
-          <w:kern w:val="2"/>
-          <w:sz w:val="28"/>
-          <w:szCs w:val="24"/>
-          <w:lang w:eastAsia="en-US"/>
-          <w14:ligatures w14:val="standardContextual"/>
         </w:rPr>
       </w:sdtEndPr>
       <w:sdtContent>
@@ -66,7 +68,7 @@
           <w:r>
             <w:fldChar w:fldCharType="separate"/>
           </w:r>
-          <w:hyperlink w:anchor="_Toc229220043" w:history="1">
+          <w:hyperlink w:anchor="_Toc229220720" w:history="1">
             <w:r>
               <w:rPr>
                 <w:rStyle w:val="Hiperhivatkozs"/>
@@ -93,7 +95,7 @@
                 <w:noProof/>
                 <w:webHidden/>
               </w:rPr>
-              <w:instrText xml:space="preserve"> PAGEREF _Toc229220043 \h </w:instrText>
+              <w:instrText xml:space="preserve"> PAGEREF _Toc229220720 \h </w:instrText>
             </w:r>
             <w:r>
               <w:rPr>
@@ -137,7 +139,7 @@
               <w:lang w:eastAsia="hu-HU"/>
             </w:rPr>
           </w:pPr>
-          <w:hyperlink w:anchor="_Toc229220044" w:history="1">
+          <w:hyperlink w:anchor="_Toc229220721" w:history="1">
             <w:r>
               <w:rPr>
                 <w:rStyle w:val="Hiperhivatkozs"/>
@@ -164,7 +166,7 @@
                 <w:noProof/>
                 <w:webHidden/>
               </w:rPr>
-              <w:instrText xml:space="preserve"> PAGEREF _Toc229220044 \h </w:instrText>
+              <w:instrText xml:space="preserve"> PAGEREF _Toc229220721 \h </w:instrText>
             </w:r>
             <w:r>
               <w:rPr>
@@ -208,7 +210,7 @@
               <w:lang w:eastAsia="hu-HU"/>
             </w:rPr>
           </w:pPr>
-          <w:hyperlink w:anchor="_Toc229220045" w:history="1">
+          <w:hyperlink w:anchor="_Toc229220722" w:history="1">
             <w:r>
               <w:rPr>
                 <w:rStyle w:val="Hiperhivatkozs"/>
@@ -235,7 +237,7 @@
                 <w:noProof/>
                 <w:webHidden/>
               </w:rPr>
-              <w:instrText xml:space="preserve"> PAGEREF _Toc229220045 \h </w:instrText>
+              <w:instrText xml:space="preserve"> PAGEREF _Toc229220722 \h </w:instrText>
             </w:r>
             <w:r>
               <w:rPr>
@@ -279,7 +281,7 @@
               <w:lang w:eastAsia="hu-HU"/>
             </w:rPr>
           </w:pPr>
-          <w:hyperlink w:anchor="_Toc229220046" w:history="1">
+          <w:hyperlink w:anchor="_Toc229220723" w:history="1">
             <w:r>
               <w:rPr>
                 <w:rStyle w:val="Hiperhivatkozs"/>
@@ -306,7 +308,7 @@
                 <w:noProof/>
                 <w:webHidden/>
               </w:rPr>
-              <w:instrText xml:space="preserve"> PAGEREF _Toc229220046 \h </w:instrText>
+              <w:instrText xml:space="preserve"> PAGEREF _Toc229220723 \h </w:instrText>
             </w:r>
             <w:r>
               <w:rPr>
@@ -350,7 +352,7 @@
               <w:lang w:eastAsia="hu-HU"/>
             </w:rPr>
           </w:pPr>
-          <w:hyperlink w:anchor="_Toc229220047" w:history="1">
+          <w:hyperlink w:anchor="_Toc229220724" w:history="1">
             <w:r>
               <w:rPr>
                 <w:rStyle w:val="Hiperhivatkozs"/>
@@ -377,7 +379,7 @@
                 <w:noProof/>
                 <w:webHidden/>
               </w:rPr>
-              <w:instrText xml:space="preserve"> PAGEREF _Toc229220047 \h </w:instrText>
+              <w:instrText xml:space="preserve"> PAGEREF _Toc229220724 \h </w:instrText>
             </w:r>
             <w:r>
               <w:rPr>
@@ -398,6 +400,77 @@
                 <w:webHidden/>
               </w:rPr>
               <w:t>3</w:t>
+            </w:r>
+            <w:r>
+              <w:rPr>
+                <w:noProof/>
+                <w:webHidden/>
+              </w:rPr>
+              <w:fldChar w:fldCharType="end"/>
+            </w:r>
+          </w:hyperlink>
+        </w:p>
+        <w:p>
+          <w:pPr>
+            <w:pStyle w:val="TJ1"/>
+            <w:tabs>
+              <w:tab w:val="right" w:leader="dot" w:pos="9062"/>
+            </w:tabs>
+            <w:rPr>
+              <w:rFonts w:asciiTheme="minorHAnsi" w:eastAsiaTheme="minorEastAsia" w:hAnsiTheme="minorHAnsi"/>
+              <w:noProof/>
+              <w:sz w:val="24"/>
+              <w:lang w:eastAsia="hu-HU"/>
+            </w:rPr>
+          </w:pPr>
+          <w:hyperlink w:anchor="_Toc229220725" w:history="1">
+            <w:r>
+              <w:rPr>
+                <w:rStyle w:val="Hiperhivatkozs"/>
+                <w:noProof/>
+              </w:rPr>
+              <w:t>Feladatok felosztása</w:t>
+            </w:r>
+            <w:r>
+              <w:rPr>
+                <w:noProof/>
+                <w:webHidden/>
+              </w:rPr>
+              <w:tab/>
+            </w:r>
+            <w:r>
+              <w:rPr>
+                <w:noProof/>
+                <w:webHidden/>
+              </w:rPr>
+              <w:fldChar w:fldCharType="begin"/>
+            </w:r>
+            <w:r>
+              <w:rPr>
+                <w:noProof/>
+                <w:webHidden/>
+              </w:rPr>
+              <w:instrText xml:space="preserve"> PAGEREF _Toc229220725 \h </w:instrText>
+            </w:r>
+            <w:r>
+              <w:rPr>
+                <w:noProof/>
+                <w:webHidden/>
+              </w:rPr>
+            </w:r>
+            <w:r>
+              <w:rPr>
+                <w:noProof/>
+                <w:webHidden/>
+              </w:rPr>
+              <w:fldChar w:fldCharType="separate"/>
+            </w:r>
+            <w:r>
+              <w:rPr>
+                <w:noProof/>
+                <w:webHidden/>
+              </w:rPr>
+              <w:t>4</w:t>
             </w:r>
             <w:r>
               <w:rPr>
@@ -451,7 +524,7 @@
       <w:pPr>
         <w:pStyle w:val="Cmsor1"/>
       </w:pPr>
-      <w:bookmarkStart w:id="0" w:name="_Toc229220043"/>
+      <w:bookmarkStart w:id="0" w:name="_Toc229220720"/>
       <w:r>
         <w:t>Oldal Specifikációk</w:t>
       </w:r>
@@ -461,7 +534,7 @@
       <w:pPr>
         <w:pStyle w:val="Cmsor2"/>
       </w:pPr>
-      <w:bookmarkStart w:id="1" w:name="_Toc229220044"/>
+      <w:bookmarkStart w:id="1" w:name="_Toc229220721"/>
       <w:r>
         <w:t>Főmenü</w:t>
       </w:r>
@@ -523,7 +596,7 @@
       <w:pPr>
         <w:pStyle w:val="Cmsor2"/>
       </w:pPr>
-      <w:bookmarkStart w:id="2" w:name="_Toc229220045"/>
+      <w:bookmarkStart w:id="2" w:name="_Toc229220722"/>
       <w:r>
         <w:t>Témaválasztó</w:t>
       </w:r>
@@ -546,39 +619,12 @@
     </w:p>
     <w:p>
       <w:r>
-        <w:t xml:space="preserve">Az oldal tartalmát, vagyis </w:t>
-      </w:r>
-      <w:r>
-        <w:t>három</w:t>
-      </w:r>
-      <w:r>
-        <w:t xml:space="preserve"> article elemet egy section részbe tesszük bele.</w:t>
-      </w:r>
-    </w:p>
-    <w:p>
-      <w:r>
-        <w:t>Az article elemekben</w:t>
-      </w:r>
-      <w:r>
-        <w:t xml:space="preserve"> különböző témák</w:t>
-      </w:r>
-      <w:r>
-        <w:t xml:space="preserve"> </w:t>
-      </w:r>
-      <w:r>
-        <w:t>t</w:t>
-      </w:r>
-      <w:r>
-        <w:t>alálható</w:t>
-      </w:r>
-      <w:r>
-        <w:t>k</w:t>
-      </w:r>
-      <w:r>
-        <w:t>.</w:t>
-      </w:r>
-      <w:r>
-        <w:t xml:space="preserve"> A három téma PHP, JavaScript és Java. A témára rákattintva vagy a tanuló kártyákhoz jutunk, vagy  kvíz oldalra.</w:t>
+        <w:t>Az oldal tartalmát, vagyis három article elemet egy section részbe tesszük bele.</w:t>
+      </w:r>
+    </w:p>
+    <w:p>
+      <w:r>
+        <w:t>Az article elemekben különböző témák találhatók. A három téma PHP, JavaScript és Java. A témára rákattintva vagy a tanuló kártyákhoz jutunk, vagy  kvíz oldalra.</w:t>
       </w:r>
     </w:p>
     <w:p>
@@ -606,7 +652,7 @@
       <w:pPr>
         <w:pStyle w:val="Cmsor2"/>
       </w:pPr>
-      <w:bookmarkStart w:id="3" w:name="_Toc229220046"/>
+      <w:bookmarkStart w:id="3" w:name="_Toc229220723"/>
       <w:r>
         <w:lastRenderedPageBreak/>
         <w:t>Tanuló kártya</w:t>
@@ -620,54 +666,15 @@
     </w:p>
     <w:p>
       <w:r>
-        <w:t xml:space="preserve">A nav részben egy </w:t>
-      </w:r>
-      <w:r>
-        <w:t xml:space="preserve">visszanyíl, egy </w:t>
-      </w:r>
-      <w:r>
-        <w:t>ház ikon</w:t>
-      </w:r>
-      <w:r>
-        <w:t>, valamint egy lefele gördülő téma választó</w:t>
-      </w:r>
-      <w:r>
-        <w:t xml:space="preserve"> található.</w:t>
-      </w:r>
-      <w:r>
-        <w:t xml:space="preserve"> A visszanyíl a témaválasztó oldalra vezet, a ház ikon pedig vissza a főmenübe.</w:t>
-      </w:r>
-      <w:r>
-        <w:t xml:space="preserve"> A </w:t>
-      </w:r>
-      <w:r>
-        <w:t>lefele gördülő téma választó</w:t>
-      </w:r>
-      <w:r>
-        <w:t>ban a többi téma között tudunk váltogatni.</w:t>
-      </w:r>
-    </w:p>
-    <w:p>
-      <w:r>
-        <w:t>Az oldal tartalmát, vagyis</w:t>
-      </w:r>
-      <w:r>
-        <w:t xml:space="preserve"> egy aside,</w:t>
-      </w:r>
-      <w:r>
-        <w:t xml:space="preserve"> </w:t>
-      </w:r>
-      <w:r>
-        <w:t>egy</w:t>
-      </w:r>
-      <w:r>
-        <w:t xml:space="preserve"> article elemet</w:t>
-      </w:r>
-      <w:r>
-        <w:t xml:space="preserve"> és két gombot</w:t>
-      </w:r>
-      <w:r>
-        <w:t xml:space="preserve"> egy section részbe tesszük bele.</w:t>
+        <w:t>A nav részben egy visszanyíl, egy ház ikon, valamint egy lefele gördülő téma választó található. A visszanyíl a témaválasztó oldalra vezet, a ház ikon pedig vissza a főmenübe.</w:t>
+      </w:r>
+      <w:r>
+        <w:t xml:space="preserve"> A lefele gördülő téma választóban a többi téma között tudunk váltogatni.</w:t>
+      </w:r>
+    </w:p>
+    <w:p>
+      <w:r>
+        <w:t>Az oldal tartalmát, vagyis egy aside, egy article elemet és két gombot egy section részbe tesszük bele.</w:t>
       </w:r>
     </w:p>
     <w:p>
@@ -694,7 +701,7 @@
       <w:pPr>
         <w:pStyle w:val="Cmsor2"/>
       </w:pPr>
-      <w:bookmarkStart w:id="4" w:name="_Toc229220047"/>
+      <w:bookmarkStart w:id="4" w:name="_Toc229220724"/>
       <w:r>
         <w:t>Kvíz</w:t>
       </w:r>
@@ -735,6 +742,188 @@
         <w:t>A footer részben a készítők neve található.</w:t>
       </w:r>
     </w:p>
+    <w:p>
+      <w:pPr>
+        <w:pStyle w:val="Cmsor1"/>
+      </w:pPr>
+      <w:bookmarkStart w:id="5" w:name="_Toc229220725"/>
+      <w:r>
+        <w:lastRenderedPageBreak/>
+        <w:t>Feladatok felosztása</w:t>
+      </w:r>
+      <w:bookmarkEnd w:id="5"/>
+    </w:p>
+    <w:tbl>
+      <w:tblPr>
+        <w:tblStyle w:val="Rcsostblzat"/>
+        <w:tblW w:w="0" w:type="auto"/>
+        <w:jc w:val="center"/>
+        <w:tblLook w:val="04A0" w:firstRow="1" w:lastRow="0" w:firstColumn="1" w:lastColumn="0" w:noHBand="0" w:noVBand="1"/>
+      </w:tblPr>
+      <w:tblGrid>
+        <w:gridCol w:w="4531"/>
+        <w:gridCol w:w="4531"/>
+      </w:tblGrid>
+      <w:tr>
+        <w:trPr>
+          <w:jc w:val="center"/>
+        </w:trPr>
+        <w:tc>
+          <w:tcPr>
+            <w:tcW w:w="4531" w:type="dxa"/>
+            <w:shd w:val="clear" w:color="auto" w:fill="FAE2D5" w:themeFill="accent2" w:themeFillTint="33"/>
+          </w:tcPr>
+          <w:p>
+            <w:pPr>
+              <w:jc w:val="center"/>
+            </w:pPr>
+            <w:r>
+              <w:t>Bea</w:t>
+            </w:r>
+          </w:p>
+        </w:tc>
+        <w:tc>
+          <w:tcPr>
+            <w:tcW w:w="4531" w:type="dxa"/>
+            <w:shd w:val="clear" w:color="auto" w:fill="DAE9F7" w:themeFill="text2" w:themeFillTint="1A"/>
+          </w:tcPr>
+          <w:p>
+            <w:pPr>
+              <w:jc w:val="center"/>
+            </w:pPr>
+            <w:r>
+              <w:t>Feri</w:t>
+            </w:r>
+          </w:p>
+        </w:tc>
+      </w:tr>
+      <w:tr>
+        <w:trPr>
+          <w:jc w:val="center"/>
+        </w:trPr>
+        <w:tc>
+          <w:tcPr>
+            <w:tcW w:w="4531" w:type="dxa"/>
+          </w:tcPr>
+          <w:p>
+            <w:pPr>
+              <w:jc w:val="center"/>
+            </w:pPr>
+          </w:p>
+        </w:tc>
+        <w:tc>
+          <w:tcPr>
+            <w:tcW w:w="4531" w:type="dxa"/>
+          </w:tcPr>
+          <w:p>
+            <w:pPr>
+              <w:jc w:val="center"/>
+            </w:pPr>
+          </w:p>
+        </w:tc>
+      </w:tr>
+      <w:tr>
+        <w:trPr>
+          <w:jc w:val="center"/>
+        </w:trPr>
+        <w:tc>
+          <w:tcPr>
+            <w:tcW w:w="4531" w:type="dxa"/>
+          </w:tcPr>
+          <w:p>
+            <w:pPr>
+              <w:jc w:val="center"/>
+            </w:pPr>
+          </w:p>
+        </w:tc>
+        <w:tc>
+          <w:tcPr>
+            <w:tcW w:w="4531" w:type="dxa"/>
+          </w:tcPr>
+          <w:p>
+            <w:pPr>
+              <w:jc w:val="center"/>
+            </w:pPr>
+          </w:p>
+        </w:tc>
+      </w:tr>
+      <w:tr>
+        <w:trPr>
+          <w:jc w:val="center"/>
+        </w:trPr>
+        <w:tc>
+          <w:tcPr>
+            <w:tcW w:w="4531" w:type="dxa"/>
+          </w:tcPr>
+          <w:p>
+            <w:pPr>
+              <w:jc w:val="center"/>
+            </w:pPr>
+          </w:p>
+        </w:tc>
+        <w:tc>
+          <w:tcPr>
+            <w:tcW w:w="4531" w:type="dxa"/>
+          </w:tcPr>
+          <w:p>
+            <w:pPr>
+              <w:jc w:val="center"/>
+            </w:pPr>
+          </w:p>
+        </w:tc>
+      </w:tr>
+      <w:tr>
+        <w:trPr>
+          <w:jc w:val="center"/>
+        </w:trPr>
+        <w:tc>
+          <w:tcPr>
+            <w:tcW w:w="4531" w:type="dxa"/>
+          </w:tcPr>
+          <w:p>
+            <w:pPr>
+              <w:jc w:val="center"/>
+            </w:pPr>
+          </w:p>
+        </w:tc>
+        <w:tc>
+          <w:tcPr>
+            <w:tcW w:w="4531" w:type="dxa"/>
+          </w:tcPr>
+          <w:p>
+            <w:pPr>
+              <w:jc w:val="center"/>
+            </w:pPr>
+          </w:p>
+        </w:tc>
+      </w:tr>
+      <w:tr>
+        <w:trPr>
+          <w:jc w:val="center"/>
+        </w:trPr>
+        <w:tc>
+          <w:tcPr>
+            <w:tcW w:w="4531" w:type="dxa"/>
+          </w:tcPr>
+          <w:p>
+            <w:pPr>
+              <w:jc w:val="center"/>
+            </w:pPr>
+          </w:p>
+        </w:tc>
+        <w:tc>
+          <w:tcPr>
+            <w:tcW w:w="4531" w:type="dxa"/>
+          </w:tcPr>
+          <w:p>
+            <w:pPr>
+              <w:jc w:val="center"/>
+            </w:pPr>
+          </w:p>
+        </w:tc>
+      </w:tr>
+    </w:tbl>
+    <w:p/>
     <w:sectPr>
       <w:pgSz w:w="11906" w:h="16838"/>
       <w:pgMar w:top="1417" w:right="1417" w:bottom="1417" w:left="1417" w:header="708" w:footer="708" w:gutter="0"/>
@@ -1738,6 +1927,25 @@
       <w:u w:val="single"/>
     </w:rPr>
   </w:style>
+  <w:style w:type="table" w:styleId="Rcsostblzat">
+    <w:name w:val="Table Grid"/>
+    <w:basedOn w:val="Normltblzat"/>
+    <w:uiPriority w:val="39"/>
+    <w:rsid w:val="004360A1"/>
+    <w:pPr>
+      <w:spacing w:after="0" w:line="240" w:lineRule="auto"/>
+    </w:pPr>
+    <w:tblPr>
+      <w:tblBorders>
+        <w:top w:val="single" w:sz="4" w:space="0" w:color="auto"/>
+        <w:left w:val="single" w:sz="4" w:space="0" w:color="auto"/>
+        <w:bottom w:val="single" w:sz="4" w:space="0" w:color="auto"/>
+        <w:right w:val="single" w:sz="4" w:space="0" w:color="auto"/>
+        <w:insideH w:val="single" w:sz="4" w:space="0" w:color="auto"/>
+        <w:insideV w:val="single" w:sz="4" w:space="0" w:color="auto"/>
+      </w:tblBorders>
+    </w:tblPr>
+  </w:style>
 </w:styles>
 </file>
 

</xml_diff>

<commit_message>
feladatok felosztasa tablazat hozzaadva
</commit_message>
<xml_diff>
--- a/QuizCards Dokumentáció.docx
+++ b/QuizCards Dokumentáció.docx
@@ -4,6 +4,15 @@
   <w:body>
     <w:sdt>
       <w:sdtPr>
+        <w:rPr>
+          <w:rFonts w:ascii="Arial" w:eastAsiaTheme="minorHAnsi" w:hAnsi="Arial" w:cstheme="minorBidi"/>
+          <w:color w:val="auto"/>
+          <w:kern w:val="2"/>
+          <w:sz w:val="28"/>
+          <w:szCs w:val="24"/>
+          <w:lang w:eastAsia="en-US"/>
+          <w14:ligatures w14:val="standardContextual"/>
+        </w:rPr>
         <w:id w:val="1179936330"/>
         <w:docPartObj>
           <w:docPartGallery w:val="Table of Contents"/>
@@ -12,15 +21,8 @@
       </w:sdtPr>
       <w:sdtEndPr>
         <w:rPr>
-          <w:rFonts w:ascii="Arial" w:eastAsiaTheme="minorHAnsi" w:hAnsi="Arial" w:cstheme="minorBidi"/>
           <w:b/>
           <w:bCs/>
-          <w:color w:val="auto"/>
-          <w:kern w:val="2"/>
-          <w:sz w:val="28"/>
-          <w:szCs w:val="24"/>
-          <w:lang w:eastAsia="en-US"/>
-          <w14:ligatures w14:val="standardContextual"/>
         </w:rPr>
       </w:sdtEndPr>
       <w:sdtContent>
@@ -66,7 +68,7 @@
           <w:r>
             <w:fldChar w:fldCharType="separate"/>
           </w:r>
-          <w:hyperlink w:anchor="_Toc229220043" w:history="1">
+          <w:hyperlink w:anchor="_Toc229220720" w:history="1">
             <w:r>
               <w:rPr>
                 <w:rStyle w:val="Hiperhivatkozs"/>
@@ -93,7 +95,7 @@
                 <w:noProof/>
                 <w:webHidden/>
               </w:rPr>
-              <w:instrText xml:space="preserve"> PAGEREF _Toc229220043 \h </w:instrText>
+              <w:instrText xml:space="preserve"> PAGEREF _Toc229220720 \h </w:instrText>
             </w:r>
             <w:r>
               <w:rPr>
@@ -137,7 +139,7 @@
               <w:lang w:eastAsia="hu-HU"/>
             </w:rPr>
           </w:pPr>
-          <w:hyperlink w:anchor="_Toc229220044" w:history="1">
+          <w:hyperlink w:anchor="_Toc229220721" w:history="1">
             <w:r>
               <w:rPr>
                 <w:rStyle w:val="Hiperhivatkozs"/>
@@ -164,7 +166,7 @@
                 <w:noProof/>
                 <w:webHidden/>
               </w:rPr>
-              <w:instrText xml:space="preserve"> PAGEREF _Toc229220044 \h </w:instrText>
+              <w:instrText xml:space="preserve"> PAGEREF _Toc229220721 \h </w:instrText>
             </w:r>
             <w:r>
               <w:rPr>
@@ -208,7 +210,7 @@
               <w:lang w:eastAsia="hu-HU"/>
             </w:rPr>
           </w:pPr>
-          <w:hyperlink w:anchor="_Toc229220045" w:history="1">
+          <w:hyperlink w:anchor="_Toc229220722" w:history="1">
             <w:r>
               <w:rPr>
                 <w:rStyle w:val="Hiperhivatkozs"/>
@@ -235,7 +237,7 @@
                 <w:noProof/>
                 <w:webHidden/>
               </w:rPr>
-              <w:instrText xml:space="preserve"> PAGEREF _Toc229220045 \h </w:instrText>
+              <w:instrText xml:space="preserve"> PAGEREF _Toc229220722 \h </w:instrText>
             </w:r>
             <w:r>
               <w:rPr>
@@ -279,7 +281,7 @@
               <w:lang w:eastAsia="hu-HU"/>
             </w:rPr>
           </w:pPr>
-          <w:hyperlink w:anchor="_Toc229220046" w:history="1">
+          <w:hyperlink w:anchor="_Toc229220723" w:history="1">
             <w:r>
               <w:rPr>
                 <w:rStyle w:val="Hiperhivatkozs"/>
@@ -306,7 +308,7 @@
                 <w:noProof/>
                 <w:webHidden/>
               </w:rPr>
-              <w:instrText xml:space="preserve"> PAGEREF _Toc229220046 \h </w:instrText>
+              <w:instrText xml:space="preserve"> PAGEREF _Toc229220723 \h </w:instrText>
             </w:r>
             <w:r>
               <w:rPr>
@@ -350,7 +352,7 @@
               <w:lang w:eastAsia="hu-HU"/>
             </w:rPr>
           </w:pPr>
-          <w:hyperlink w:anchor="_Toc229220047" w:history="1">
+          <w:hyperlink w:anchor="_Toc229220724" w:history="1">
             <w:r>
               <w:rPr>
                 <w:rStyle w:val="Hiperhivatkozs"/>
@@ -377,7 +379,7 @@
                 <w:noProof/>
                 <w:webHidden/>
               </w:rPr>
-              <w:instrText xml:space="preserve"> PAGEREF _Toc229220047 \h </w:instrText>
+              <w:instrText xml:space="preserve"> PAGEREF _Toc229220724 \h </w:instrText>
             </w:r>
             <w:r>
               <w:rPr>
@@ -398,6 +400,77 @@
                 <w:webHidden/>
               </w:rPr>
               <w:t>3</w:t>
+            </w:r>
+            <w:r>
+              <w:rPr>
+                <w:noProof/>
+                <w:webHidden/>
+              </w:rPr>
+              <w:fldChar w:fldCharType="end"/>
+            </w:r>
+          </w:hyperlink>
+        </w:p>
+        <w:p>
+          <w:pPr>
+            <w:pStyle w:val="TJ1"/>
+            <w:tabs>
+              <w:tab w:val="right" w:leader="dot" w:pos="9062"/>
+            </w:tabs>
+            <w:rPr>
+              <w:rFonts w:asciiTheme="minorHAnsi" w:eastAsiaTheme="minorEastAsia" w:hAnsiTheme="minorHAnsi"/>
+              <w:noProof/>
+              <w:sz w:val="24"/>
+              <w:lang w:eastAsia="hu-HU"/>
+            </w:rPr>
+          </w:pPr>
+          <w:hyperlink w:anchor="_Toc229220725" w:history="1">
+            <w:r>
+              <w:rPr>
+                <w:rStyle w:val="Hiperhivatkozs"/>
+                <w:noProof/>
+              </w:rPr>
+              <w:t>Feladatok felosztása</w:t>
+            </w:r>
+            <w:r>
+              <w:rPr>
+                <w:noProof/>
+                <w:webHidden/>
+              </w:rPr>
+              <w:tab/>
+            </w:r>
+            <w:r>
+              <w:rPr>
+                <w:noProof/>
+                <w:webHidden/>
+              </w:rPr>
+              <w:fldChar w:fldCharType="begin"/>
+            </w:r>
+            <w:r>
+              <w:rPr>
+                <w:noProof/>
+                <w:webHidden/>
+              </w:rPr>
+              <w:instrText xml:space="preserve"> PAGEREF _Toc229220725 \h </w:instrText>
+            </w:r>
+            <w:r>
+              <w:rPr>
+                <w:noProof/>
+                <w:webHidden/>
+              </w:rPr>
+            </w:r>
+            <w:r>
+              <w:rPr>
+                <w:noProof/>
+                <w:webHidden/>
+              </w:rPr>
+              <w:fldChar w:fldCharType="separate"/>
+            </w:r>
+            <w:r>
+              <w:rPr>
+                <w:noProof/>
+                <w:webHidden/>
+              </w:rPr>
+              <w:t>4</w:t>
             </w:r>
             <w:r>
               <w:rPr>
@@ -451,7 +524,7 @@
       <w:pPr>
         <w:pStyle w:val="Cmsor1"/>
       </w:pPr>
-      <w:bookmarkStart w:id="0" w:name="_Toc229220043"/>
+      <w:bookmarkStart w:id="0" w:name="_Toc229220720"/>
       <w:r>
         <w:t>Oldal Specifikációk</w:t>
       </w:r>
@@ -461,7 +534,7 @@
       <w:pPr>
         <w:pStyle w:val="Cmsor2"/>
       </w:pPr>
-      <w:bookmarkStart w:id="1" w:name="_Toc229220044"/>
+      <w:bookmarkStart w:id="1" w:name="_Toc229220721"/>
       <w:r>
         <w:t>Főmenü</w:t>
       </w:r>
@@ -523,7 +596,7 @@
       <w:pPr>
         <w:pStyle w:val="Cmsor2"/>
       </w:pPr>
-      <w:bookmarkStart w:id="2" w:name="_Toc229220045"/>
+      <w:bookmarkStart w:id="2" w:name="_Toc229220722"/>
       <w:r>
         <w:t>Témaválasztó</w:t>
       </w:r>
@@ -546,39 +619,12 @@
     </w:p>
     <w:p>
       <w:r>
-        <w:t xml:space="preserve">Az oldal tartalmát, vagyis </w:t>
-      </w:r>
-      <w:r>
-        <w:t>három</w:t>
-      </w:r>
-      <w:r>
-        <w:t xml:space="preserve"> article elemet egy section részbe tesszük bele.</w:t>
-      </w:r>
-    </w:p>
-    <w:p>
-      <w:r>
-        <w:t>Az article elemekben</w:t>
-      </w:r>
-      <w:r>
-        <w:t xml:space="preserve"> különböző témák</w:t>
-      </w:r>
-      <w:r>
-        <w:t xml:space="preserve"> </w:t>
-      </w:r>
-      <w:r>
-        <w:t>t</w:t>
-      </w:r>
-      <w:r>
-        <w:t>alálható</w:t>
-      </w:r>
-      <w:r>
-        <w:t>k</w:t>
-      </w:r>
-      <w:r>
-        <w:t>.</w:t>
-      </w:r>
-      <w:r>
-        <w:t xml:space="preserve"> A három téma PHP, JavaScript és Java. A témára rákattintva vagy a tanuló kártyákhoz jutunk, vagy  kvíz oldalra.</w:t>
+        <w:t>Az oldal tartalmát, vagyis három article elemet egy section részbe tesszük bele.</w:t>
+      </w:r>
+    </w:p>
+    <w:p>
+      <w:r>
+        <w:t>Az article elemekben különböző témák találhatók. A három téma PHP, JavaScript és Java. A témára rákattintva vagy a tanuló kártyákhoz jutunk, vagy  kvíz oldalra.</w:t>
       </w:r>
     </w:p>
     <w:p>
@@ -606,7 +652,7 @@
       <w:pPr>
         <w:pStyle w:val="Cmsor2"/>
       </w:pPr>
-      <w:bookmarkStart w:id="3" w:name="_Toc229220046"/>
+      <w:bookmarkStart w:id="3" w:name="_Toc229220723"/>
       <w:r>
         <w:lastRenderedPageBreak/>
         <w:t>Tanuló kártya</w:t>
@@ -620,54 +666,15 @@
     </w:p>
     <w:p>
       <w:r>
-        <w:t xml:space="preserve">A nav részben egy </w:t>
-      </w:r>
-      <w:r>
-        <w:t xml:space="preserve">visszanyíl, egy </w:t>
-      </w:r>
-      <w:r>
-        <w:t>ház ikon</w:t>
-      </w:r>
-      <w:r>
-        <w:t>, valamint egy lefele gördülő téma választó</w:t>
-      </w:r>
-      <w:r>
-        <w:t xml:space="preserve"> található.</w:t>
-      </w:r>
-      <w:r>
-        <w:t xml:space="preserve"> A visszanyíl a témaválasztó oldalra vezet, a ház ikon pedig vissza a főmenübe.</w:t>
-      </w:r>
-      <w:r>
-        <w:t xml:space="preserve"> A </w:t>
-      </w:r>
-      <w:r>
-        <w:t>lefele gördülő téma választó</w:t>
-      </w:r>
-      <w:r>
-        <w:t>ban a többi téma között tudunk váltogatni.</w:t>
-      </w:r>
-    </w:p>
-    <w:p>
-      <w:r>
-        <w:t>Az oldal tartalmát, vagyis</w:t>
-      </w:r>
-      <w:r>
-        <w:t xml:space="preserve"> egy aside,</w:t>
-      </w:r>
-      <w:r>
-        <w:t xml:space="preserve"> </w:t>
-      </w:r>
-      <w:r>
-        <w:t>egy</w:t>
-      </w:r>
-      <w:r>
-        <w:t xml:space="preserve"> article elemet</w:t>
-      </w:r>
-      <w:r>
-        <w:t xml:space="preserve"> és két gombot</w:t>
-      </w:r>
-      <w:r>
-        <w:t xml:space="preserve"> egy section részbe tesszük bele.</w:t>
+        <w:t>A nav részben egy visszanyíl, egy ház ikon, valamint egy lefele gördülő téma választó található. A visszanyíl a témaválasztó oldalra vezet, a ház ikon pedig vissza a főmenübe.</w:t>
+      </w:r>
+      <w:r>
+        <w:t xml:space="preserve"> A lefele gördülő téma választóban a többi téma között tudunk váltogatni.</w:t>
+      </w:r>
+    </w:p>
+    <w:p>
+      <w:r>
+        <w:t>Az oldal tartalmát, vagyis egy aside, egy article elemet és két gombot egy section részbe tesszük bele.</w:t>
       </w:r>
     </w:p>
     <w:p>
@@ -694,7 +701,7 @@
       <w:pPr>
         <w:pStyle w:val="Cmsor2"/>
       </w:pPr>
-      <w:bookmarkStart w:id="4" w:name="_Toc229220047"/>
+      <w:bookmarkStart w:id="4" w:name="_Toc229220724"/>
       <w:r>
         <w:t>Kvíz</w:t>
       </w:r>
@@ -735,6 +742,188 @@
         <w:t>A footer részben a készítők neve található.</w:t>
       </w:r>
     </w:p>
+    <w:p>
+      <w:pPr>
+        <w:pStyle w:val="Cmsor1"/>
+      </w:pPr>
+      <w:bookmarkStart w:id="5" w:name="_Toc229220725"/>
+      <w:r>
+        <w:lastRenderedPageBreak/>
+        <w:t>Feladatok felosztása</w:t>
+      </w:r>
+      <w:bookmarkEnd w:id="5"/>
+    </w:p>
+    <w:tbl>
+      <w:tblPr>
+        <w:tblStyle w:val="Rcsostblzat"/>
+        <w:tblW w:w="0" w:type="auto"/>
+        <w:jc w:val="center"/>
+        <w:tblLook w:val="04A0" w:firstRow="1" w:lastRow="0" w:firstColumn="1" w:lastColumn="0" w:noHBand="0" w:noVBand="1"/>
+      </w:tblPr>
+      <w:tblGrid>
+        <w:gridCol w:w="4531"/>
+        <w:gridCol w:w="4531"/>
+      </w:tblGrid>
+      <w:tr>
+        <w:trPr>
+          <w:jc w:val="center"/>
+        </w:trPr>
+        <w:tc>
+          <w:tcPr>
+            <w:tcW w:w="4531" w:type="dxa"/>
+            <w:shd w:val="clear" w:color="auto" w:fill="FAE2D5" w:themeFill="accent2" w:themeFillTint="33"/>
+          </w:tcPr>
+          <w:p>
+            <w:pPr>
+              <w:jc w:val="center"/>
+            </w:pPr>
+            <w:r>
+              <w:t>Bea</w:t>
+            </w:r>
+          </w:p>
+        </w:tc>
+        <w:tc>
+          <w:tcPr>
+            <w:tcW w:w="4531" w:type="dxa"/>
+            <w:shd w:val="clear" w:color="auto" w:fill="DAE9F7" w:themeFill="text2" w:themeFillTint="1A"/>
+          </w:tcPr>
+          <w:p>
+            <w:pPr>
+              <w:jc w:val="center"/>
+            </w:pPr>
+            <w:r>
+              <w:t>Feri</w:t>
+            </w:r>
+          </w:p>
+        </w:tc>
+      </w:tr>
+      <w:tr>
+        <w:trPr>
+          <w:jc w:val="center"/>
+        </w:trPr>
+        <w:tc>
+          <w:tcPr>
+            <w:tcW w:w="4531" w:type="dxa"/>
+          </w:tcPr>
+          <w:p>
+            <w:pPr>
+              <w:jc w:val="center"/>
+            </w:pPr>
+          </w:p>
+        </w:tc>
+        <w:tc>
+          <w:tcPr>
+            <w:tcW w:w="4531" w:type="dxa"/>
+          </w:tcPr>
+          <w:p>
+            <w:pPr>
+              <w:jc w:val="center"/>
+            </w:pPr>
+          </w:p>
+        </w:tc>
+      </w:tr>
+      <w:tr>
+        <w:trPr>
+          <w:jc w:val="center"/>
+        </w:trPr>
+        <w:tc>
+          <w:tcPr>
+            <w:tcW w:w="4531" w:type="dxa"/>
+          </w:tcPr>
+          <w:p>
+            <w:pPr>
+              <w:jc w:val="center"/>
+            </w:pPr>
+          </w:p>
+        </w:tc>
+        <w:tc>
+          <w:tcPr>
+            <w:tcW w:w="4531" w:type="dxa"/>
+          </w:tcPr>
+          <w:p>
+            <w:pPr>
+              <w:jc w:val="center"/>
+            </w:pPr>
+          </w:p>
+        </w:tc>
+      </w:tr>
+      <w:tr>
+        <w:trPr>
+          <w:jc w:val="center"/>
+        </w:trPr>
+        <w:tc>
+          <w:tcPr>
+            <w:tcW w:w="4531" w:type="dxa"/>
+          </w:tcPr>
+          <w:p>
+            <w:pPr>
+              <w:jc w:val="center"/>
+            </w:pPr>
+          </w:p>
+        </w:tc>
+        <w:tc>
+          <w:tcPr>
+            <w:tcW w:w="4531" w:type="dxa"/>
+          </w:tcPr>
+          <w:p>
+            <w:pPr>
+              <w:jc w:val="center"/>
+            </w:pPr>
+          </w:p>
+        </w:tc>
+      </w:tr>
+      <w:tr>
+        <w:trPr>
+          <w:jc w:val="center"/>
+        </w:trPr>
+        <w:tc>
+          <w:tcPr>
+            <w:tcW w:w="4531" w:type="dxa"/>
+          </w:tcPr>
+          <w:p>
+            <w:pPr>
+              <w:jc w:val="center"/>
+            </w:pPr>
+          </w:p>
+        </w:tc>
+        <w:tc>
+          <w:tcPr>
+            <w:tcW w:w="4531" w:type="dxa"/>
+          </w:tcPr>
+          <w:p>
+            <w:pPr>
+              <w:jc w:val="center"/>
+            </w:pPr>
+          </w:p>
+        </w:tc>
+      </w:tr>
+      <w:tr>
+        <w:trPr>
+          <w:jc w:val="center"/>
+        </w:trPr>
+        <w:tc>
+          <w:tcPr>
+            <w:tcW w:w="4531" w:type="dxa"/>
+          </w:tcPr>
+          <w:p>
+            <w:pPr>
+              <w:jc w:val="center"/>
+            </w:pPr>
+          </w:p>
+        </w:tc>
+        <w:tc>
+          <w:tcPr>
+            <w:tcW w:w="4531" w:type="dxa"/>
+          </w:tcPr>
+          <w:p>
+            <w:pPr>
+              <w:jc w:val="center"/>
+            </w:pPr>
+          </w:p>
+        </w:tc>
+      </w:tr>
+    </w:tbl>
+    <w:p/>
     <w:sectPr>
       <w:pgSz w:w="11906" w:h="16838"/>
       <w:pgMar w:top="1417" w:right="1417" w:bottom="1417" w:left="1417" w:header="708" w:footer="708" w:gutter="0"/>
@@ -1738,6 +1927,25 @@
       <w:u w:val="single"/>
     </w:rPr>
   </w:style>
+  <w:style w:type="table" w:styleId="Rcsostblzat">
+    <w:name w:val="Table Grid"/>
+    <w:basedOn w:val="Normltblzat"/>
+    <w:uiPriority w:val="39"/>
+    <w:rsid w:val="004360A1"/>
+    <w:pPr>
+      <w:spacing w:after="0" w:line="240" w:lineRule="auto"/>
+    </w:pPr>
+    <w:tblPr>
+      <w:tblBorders>
+        <w:top w:val="single" w:sz="4" w:space="0" w:color="auto"/>
+        <w:left w:val="single" w:sz="4" w:space="0" w:color="auto"/>
+        <w:bottom w:val="single" w:sz="4" w:space="0" w:color="auto"/>
+        <w:right w:val="single" w:sz="4" w:space="0" w:color="auto"/>
+        <w:insideH w:val="single" w:sz="4" w:space="0" w:color="auto"/>
+        <w:insideV w:val="single" w:sz="4" w:space="0" w:color="auto"/>
+      </w:tblBorders>
+    </w:tblPr>
+  </w:style>
 </w:styles>
 </file>
 

</xml_diff>